<commit_message>
Update partial report documents
</commit_message>
<xml_diff>
--- a/docs/Informe_Entrega_Parcial_Proyecto_ML_23F.docx
+++ b/docs/Informe_Entrega_Parcial_Proyecto_ML_23F.docx
@@ -156,19 +156,7 @@
         <w:rPr/>
       </w:pPr>
       <w:r>
-        <w:rPr>
-          <w:b w:val="1"/>
-          <w:bCs w:val="1"/>
-          <w:sz w:val="40"/>
-          <w:szCs w:val="40"/>
-          <w:rtl w:val="0"/>
-        </w:rPr>
-        <w:t xml:space="preserve">Análisis inteligente de los documentos desclasificados del 23-F mediante Machine Learning, NLP y grafos</w:t>
-      </w:r>
-      <w:r>
-        <w:rPr>
-          <w:rtl w:val="0"/>
-        </w:rPr>
+        <w:t>Análisis inteligente de los documentos desclasificados del 23-F mediante Machine Learning, NLP, grafos y recuperación documental</w:t>
       </w:r>
     </w:p>
     <w:p>
@@ -535,22 +523,8 @@
             <w:vAlign w:val="top"/>
           </w:tcPr>
           <w:p>
-            <w:pPr>
-              <w:jc w:val="center"/>
-              <w:rPr/>
-            </w:pPr>
             <w:r>
-              <w:rPr>
-                <w:sz w:val="18"/>
-                <w:szCs w:val="18"/>
-                <w:rtl w:val="0"/>
-              </w:rPr>
-              <w:t xml:space="preserve">Informe de propuesta, metodología y planificación de mini casos</w:t>
-            </w:r>
-            <w:r>
-              <w:rPr>
-                <w:rtl w:val="0"/>
-              </w:rPr>
+              <w:t>Informe parcial actualizado de metodología, corpus y mini casos</w:t>
             </w:r>
           </w:p>
         </w:tc>
@@ -687,10 +661,7 @@
         <w:rPr/>
       </w:pPr>
       <w:r>
-        <w:rPr>
-          <w:rtl w:val="0"/>
-        </w:rPr>
-        <w:t xml:space="preserve">6. Análisis exploratorio inicial previsto</w:t>
+        <w:t>6. Análisis exploratorio y limpieza general</w:t>
       </w:r>
     </w:p>
     <w:p>
@@ -709,121 +680,84 @@
         <w:rPr/>
       </w:pPr>
       <w:r>
-        <w:rPr>
-          <w:rtl w:val="0"/>
-        </w:rPr>
-        <w:t xml:space="preserve">   7.1 Mini caso 1 - Auditoría y EDA documental</w:t>
-      </w:r>
-    </w:p>
-    <w:p>
-      <w:pPr>
-        <w:rPr/>
-      </w:pPr>
-      <w:r>
-        <w:rPr>
-          <w:rtl w:val="0"/>
-        </w:rPr>
-        <w:t xml:space="preserve">   7.2 Mini caso 2 - Clasificación automática de documentos</w:t>
-      </w:r>
-    </w:p>
-    <w:p>
-      <w:pPr>
-        <w:rPr/>
-      </w:pPr>
-      <w:r>
-        <w:rPr>
-          <w:rtl w:val="0"/>
-        </w:rPr>
-        <w:t xml:space="preserve">   7.3 Mini caso 3 - Clustering temático y topic modeling</w:t>
-      </w:r>
-    </w:p>
-    <w:p>
-      <w:pPr>
-        <w:rPr/>
-      </w:pPr>
-      <w:r>
-        <w:rPr>
-          <w:rtl w:val="0"/>
-        </w:rPr>
-        <w:t xml:space="preserve">   7.4 Mini caso 4 - Grafo de actores, instituciones y lugares</w:t>
-      </w:r>
-    </w:p>
-    <w:p>
-      <w:pPr>
-        <w:rPr/>
-      </w:pPr>
-      <w:r>
-        <w:rPr>
-          <w:rtl w:val="0"/>
-        </w:rPr>
-        <w:t xml:space="preserve">   7.5 Mini caso 5 - Análisis temporal y buscador semántico</w:t>
-      </w:r>
-    </w:p>
-    <w:p>
-      <w:pPr>
-        <w:rPr/>
-      </w:pPr>
-      <w:r>
-        <w:rPr>
-          <w:rtl w:val="0"/>
-        </w:rPr>
-        <w:t xml:space="preserve">8. Plan de trabajo hasta la entrega final</w:t>
-      </w:r>
-    </w:p>
-    <w:p>
-      <w:pPr>
-        <w:rPr/>
-      </w:pPr>
-      <w:r>
-        <w:rPr>
-          <w:rtl w:val="0"/>
-        </w:rPr>
-        <w:t xml:space="preserve">9. Organización del repositorio Git y reproducibilidad</w:t>
-      </w:r>
-    </w:p>
-    <w:p>
-      <w:pPr>
-        <w:rPr/>
-      </w:pPr>
-      <w:r>
-        <w:rPr>
-          <w:rtl w:val="0"/>
-        </w:rPr>
-        <w:t xml:space="preserve">10. Riesgos, limitaciones y plan de mitigación</w:t>
-      </w:r>
-    </w:p>
-    <w:p>
-      <w:pPr>
-        <w:rPr/>
-      </w:pPr>
-      <w:r>
-        <w:rPr>
-          <w:rtl w:val="0"/>
-        </w:rPr>
-        <w:t xml:space="preserve">11. Conclusiones de la entrega parcial</w:t>
-      </w:r>
-    </w:p>
-    <w:p>
-      <w:pPr>
-        <w:rPr/>
-      </w:pPr>
-      <w:r>
-        <w:rPr>
-          <w:rtl w:val="0"/>
-        </w:rPr>
-        <w:t xml:space="preserve">12. Referencias</w:t>
-      </w:r>
-    </w:p>
-    <w:p>
-      <w:pPr>
-        <w:rPr/>
-      </w:pPr>
-      <w:r>
-        <w:rPr>
-          <w:rtl w:val="0"/>
-        </w:rPr>
-        <w:t xml:space="preserve">13. Anexos</w:t>
-      </w:r>
+        <w:t xml:space="preserve">   7.1 Mini caso 1 - Clasificación automática de documentos por procedencia institucional</w:t>
+      </w:r>
+    </w:p>
+    <w:p>
+      <w:pPr>
+        <w:rPr/>
+      </w:pPr>
+      <w:r>
+        <w:t xml:space="preserve">   7.2 Mini caso 2 - Clustering temático y topic modeling</w:t>
+      </w:r>
+    </w:p>
+    <w:p>
+      <w:pPr>
+        <w:rPr/>
+      </w:pPr>
+      <w:r>
+        <w:t xml:space="preserve">   7.3 Mini caso 3 - Grafo de actores, instituciones y lugares</w:t>
+      </w:r>
+    </w:p>
+    <w:p>
+      <w:pPr>
+        <w:rPr/>
+      </w:pPr>
+      <w:r>
+        <w:t xml:space="preserve">   7.4 Mini caso 4 - Asistente documental semántico</w:t>
+      </w:r>
+    </w:p>
+    <w:p>
+      <w:pPr>
+        <w:rPr/>
+      </w:pPr>
+      <w:r>
+        <w:t xml:space="preserve">   7.5 Mini caso 5 - Generación automática de fichas/resúmenes documentales</w:t>
+      </w:r>
+    </w:p>
+    <w:p>
+      <w:pPr>
+        <w:rPr/>
+      </w:pPr>
+      <w:r>
+        <w:t>8. Organización del repositorio Git y reproducibilidad</w:t>
+      </w:r>
+    </w:p>
+    <w:p>
+      <w:pPr>
+        <w:rPr/>
+      </w:pPr>
+      <w:r>
+        <w:t>9. Conclusiones de la entrega parcial</w:t>
+      </w:r>
+    </w:p>
+    <w:p>
+      <w:pPr>
+        <w:rPr/>
+      </w:pPr>
+      <w:r>
+        <w:t>10. Referencias</w:t>
+      </w:r>
+    </w:p>
+    <w:p>
+      <w:pPr>
+        <w:rPr/>
+      </w:pPr>
+      <w:r>
+        <w:t>11. Anexos</w:t>
+      </w:r>
+    </w:p>
+    <w:p>
+      <w:pPr>
+        <w:rPr/>
+      </w:pPr>
+      <w:r/>
+    </w:p>
+    <w:p>
+      <w:pPr>
+        <w:rPr/>
+      </w:pPr>
+      <w:r/>
     </w:p>
     <w:p>
       <w:pPr>
@@ -855,65 +789,23 @@
         <w:rPr/>
       </w:pPr>
       <w:r>
-        <w:rPr>
-          <w:rtl w:val="0"/>
-        </w:rPr>
-        <w:t xml:space="preserve">Este informe presenta la entrega parcial del proyecto de Machine Learning basado en los documentos desclasificados relativos al intento de golpe de Estado del 23 de febrero de 1981. La propuesta consiste en construir un pipeline reproducible para recopilar, limpiar, estructurar y analizar documentos históricos mediante técnicas de </w:t>
-      </w:r>
-      <w:commentRangeStart w:id="0"/>
-      <w:r>
-        <w:rPr>
-          <w:rtl w:val="0"/>
-        </w:rPr>
-        <w:t xml:space="preserve">análisis exploratorio, NLP, clasificación, clustering, análisis de grafos y análisis temporal.</w:t>
-      </w:r>
-      <w:commentRangeEnd w:id="0"/>
-      <w:r>
-        <w:commentReference w:id="0"/>
-      </w:r>
-      <w:r>
-        <w:rPr>
-          <w:rtl w:val="0"/>
-        </w:rPr>
-      </w:r>
-    </w:p>
-    <w:p>
-      <w:pPr>
-        <w:rPr/>
-      </w:pPr>
-      <w:r>
-        <w:rPr>
-          <w:rtl w:val="0"/>
-        </w:rPr>
-        <w:t xml:space="preserve">La finalidad no es aplicar modelos de forma aislada, sino convertir un corpus documental complejo en un sistema analítico interpretable. </w:t>
-      </w:r>
-      <w:commentRangeStart w:id="1"/>
-      <w:r>
-        <w:rPr>
-          <w:rtl w:val="0"/>
-        </w:rPr>
-        <w:t xml:space="preserve">Para ello, se trabajará en cinco iniciativas complementarias</w:t>
-      </w:r>
-      <w:commentRangeEnd w:id="1"/>
-      <w:r>
-        <w:commentReference w:id="1"/>
-      </w:r>
-      <w:r>
-        <w:rPr>
-          <w:rtl w:val="0"/>
-        </w:rPr>
-        <w:t xml:space="preserve">.</w:t>
-      </w:r>
-    </w:p>
-    <w:p>
-      <w:pPr>
-        <w:rPr/>
-      </w:pPr>
-      <w:r>
-        <w:rPr>
-          <w:rtl w:val="0"/>
-        </w:rPr>
-        <w:t xml:space="preserve">La entrega parcial deja definida la estructura técnica y metodológica que se desarrollará hasta la entrega final. El informe también incluye la organización prevista del repositorio Git, los entregables técnicos, los riesgos principales y la planificación de ejecución.</w:t>
+        <w:t>Este informe presenta la entrega parcial del proyecto de Machine Learning basado en los documentos desclasificados relativos al intento de golpe de Estado del 23 de febrero de 1981. La propuesta consiste en construir un pipeline reproducible para recopilar, validar, limpiar, estructurar y analizar documentos históricos mediante análisis exploratorio, limpieza textual conservadora, clasificación textual, clustering temático, análisis de grafos, recuperación semántica y generación de fichas documentales.</w:t>
+      </w:r>
+    </w:p>
+    <w:p>
+      <w:pPr>
+        <w:rPr/>
+      </w:pPr>
+      <w:r>
+        <w:t>La finalidad no es aplicar modelos de forma aislada, sino convertir un corpus documental complejo en una base analítica trazable e interpretable. Para ello, el trabajo se organiza en cinco mini casos: clasificación institucional, clustering temático, grafo de entidades, asistente documental semántico y generación automática de fichas documentales.</w:t>
+      </w:r>
+    </w:p>
+    <w:p>
+      <w:pPr>
+        <w:rPr/>
+      </w:pPr>
+      <w:r>
+        <w:t>La entrega parcial deja consolidada la base documental, el análisis exploratorio general, la limpieza base del corpus y la definición metodológica de los mini casos. El informe también recoge la organización del repositorio Git, los criterios de reproducibilidad y las principales limitaciones metodológicas que deberán controlarse en la entrega final.</w:t>
       </w:r>
     </w:p>
     <w:p>
@@ -938,76 +830,33 @@
         </w:rPr>
         <w:t xml:space="preserve">El 23-F constituye uno de los episodios clave de la historia democrática española. La reciente publicación y difusión de documentación desclasificada permite abordar el acontecimiento desde una perspectiva documental, cuantitativa y computacional. El corpus combina materiales procedentes de distintos organismos y ministerios, lo que abre la puerta a estudiar no solo qué se menciona en cada documento, sino también </w:t>
       </w:r>
-      <w:commentRangeStart w:id="2"/>
       <w:r>
         <w:rPr>
           <w:rtl w:val="0"/>
         </w:rPr>
         <w:t xml:space="preserve">cómo se conectan actores, instituciones, fechas, lugares y temas a lo largo del tiempo.</w:t>
       </w:r>
-      <w:commentRangeEnd w:id="2"/>
-      <w:r>
-        <w:commentReference w:id="2"/>
-      </w:r>
-      <w:r>
-        <w:rPr>
-          <w:rtl w:val="0"/>
-        </w:rPr>
-      </w:r>
-    </w:p>
-    <w:p>
-      <w:pPr>
-        <w:rPr/>
-      </w:pPr>
-      <w:r>
-        <w:rPr>
-          <w:rtl w:val="0"/>
-        </w:rPr>
-        <w:t xml:space="preserve">La fuente principal del proyecto será el buscador de RTVE dedicado a los documentos desclasificados del 23-F. Esta herramienta permite consultar documentos originales, texto transcrito, resúmenes automáticos y palabras clave, como nombres propios o lugares. </w:t>
-      </w:r>
-      <w:commentRangeStart w:id="3"/>
-      <w:r>
-        <w:rPr>
-          <w:rtl w:val="0"/>
-        </w:rPr>
-        <w:t xml:space="preserve">Como fuente complementaria se utilizará la relación oficial publicada por La Moncloa, que organiza la documentación por ministerios y organismos.</w:t>
-      </w:r>
-      <w:commentRangeEnd w:id="3"/>
-      <w:r>
-        <w:commentReference w:id="3"/>
-      </w:r>
-      <w:r>
-        <w:rPr>
-          <w:rtl w:val="0"/>
-        </w:rPr>
-      </w:r>
-    </w:p>
-    <w:p>
-      <w:pPr>
-        <w:rPr/>
-      </w:pPr>
-      <w:r>
-        <w:rPr>
-          <w:rtl w:val="0"/>
-        </w:rPr>
-        <w:t xml:space="preserve">La motivación del trabajo es doble. Desde el punto de vista técnico, el dataset permite integrar distintas áreas de Machine Learning vistas en la asignatura y en el máster: </w:t>
-      </w:r>
-      <w:commentRangeStart w:id="4"/>
-      <w:r>
-        <w:rPr>
-          <w:rtl w:val="0"/>
-        </w:rPr>
-        <w:t xml:space="preserve">NLP, clasificación supervisada, clustering, visualización, grafos e interpretación de modelos</w:t>
-      </w:r>
-      <w:commentRangeEnd w:id="4"/>
-      <w:r>
-        <w:commentReference w:id="4"/>
-      </w:r>
-      <w:r>
-        <w:rPr>
-          <w:rtl w:val="0"/>
-        </w:rPr>
-        <w:t xml:space="preserve">. Desde el punto de vista aplicado, el proyecto puede convertirse en una herramienta útil para investigadores, periodistas o estudiantes interesados en explorar documentos históricos de forma eficiente.</w:t>
+      <w:r/>
+      <w:r>
+        <w:rPr>
+          <w:rtl w:val="0"/>
+        </w:rPr>
+      </w:r>
+    </w:p>
+    <w:p>
+      <w:pPr>
+        <w:rPr/>
+      </w:pPr>
+      <w:r>
+        <w:t>La fuente principal del proyecto será el buscador de RTVE dedicado a los documentos desclasificados del 23-F. Esta herramienta permite consultar documentos originales, texto transcrito, resúmenes automáticos y palabras clave, como nombres propios o lugares. La relación publicada por La Moncloa se utiliza como fuente institucional de contraste y comparación, no como sustituto del corpus RTVE. La validación realizada indica que RTVE proporciona la base documental más completa para el análisis, mientras que La Moncloa aporta metadatos institucionales trazables cuando existe correspondencia.</w:t>
+      </w:r>
+    </w:p>
+    <w:p>
+      <w:pPr>
+        <w:rPr/>
+      </w:pPr>
+      <w:r>
+        <w:t>La motivación del trabajo es doble. Desde el punto de vista técnico, el dataset permite integrar varias áreas trabajadas en la asignatura y en el máster: NLP, clasificación supervisada, clustering, grafos, recuperación semántica, visualización e interpretación de resultados. Desde el punto de vista aplicado, el proyecto puede convertirse en una herramienta útil para investigadores, periodistas o estudiantes interesados en explorar documentos históricos de forma eficiente y trazable.</w:t>
       </w:r>
     </w:p>
     <w:p>
@@ -1045,26 +894,7 @@
         <w:rPr/>
       </w:pPr>
       <w:r>
-        <w:rPr>
-          <w:rtl w:val="0"/>
-        </w:rPr>
-        <w:t xml:space="preserve">Desarrollar un análisis completo, reproducible e interpretable de los documentos desclasificados del 23-F, combinando </w:t>
-      </w:r>
-      <w:commentRangeStart w:id="5"/>
-      <w:r>
-        <w:rPr>
-          <w:rtl w:val="0"/>
-        </w:rPr>
-        <w:t xml:space="preserve">técnicas de Machine Learning, NLP, análisis de grafos y visualización para extraer patrones documentales, temáticos, temporales y relacionales.</w:t>
-      </w:r>
-      <w:commentRangeEnd w:id="5"/>
-      <w:r>
-        <w:commentReference w:id="5"/>
-      </w:r>
-      <w:r>
-        <w:rPr>
-          <w:rtl w:val="0"/>
-        </w:rPr>
+        <w:t>Desarrollar un análisis completo, reproducible e interpretable de los documentos desclasificados del 23-F, combinando técnicas de Machine Learning, NLP, análisis de grafos y recuperación documental para extraer patrones institucionales, temáticos y relacionales, y facilitar la consulta del corpus mediante evidencias trazables.</w:t>
       </w:r>
     </w:p>
     <w:p>
@@ -1322,31 +1152,8 @@
           <w:rFonts w:ascii="Arial" w:cs="Arial" w:eastAsia="Arial" w:hAnsi="Arial"/>
         </w:rPr>
       </w:pPr>
-      <w:commentRangeStart w:id="6"/>
-      <w:r>
-        <w:rPr>
-          <w:i w:val="0"/>
-          <w:iCs w:val="0"/>
-          <w:smallCaps w:val="0"/>
-          <w:strike w:val="0"/>
-          <w:color w:val="000000"/>
-          <w:sz w:val="21"/>
-          <w:szCs w:val="21"/>
-          <w:u w:val="none"/>
-          <w:shd w:fill="auto" w:val="clear"/>
-          <w:vertAlign w:val="baseline"/>
-          <w:rtl w:val="0"/>
-        </w:rPr>
-        <w:t xml:space="preserve">Proponer una aplicación práctica en forma de buscador semántico o sistema de recuperación de documentos relevantes.</w:t>
-      </w:r>
-      <w:commentRangeEnd w:id="6"/>
-      <w:r>
-        <w:commentReference w:id="6"/>
-      </w:r>
-      <w:r>
-        <w:rPr>
-          <w:rtl w:val="0"/>
-        </w:rPr>
+      <w:r>
+        <w:t>Proponer aplicaciones prácticas en forma de asistente documental semántico y generación automática de fichas documentales, manteniendo siempre la trazabilidad mediante doc_id, título y enlace al PDF original.</w:t>
       </w:r>
     </w:p>
     <w:p>
@@ -1436,17 +1243,13 @@
         </w:rPr>
         <w:t xml:space="preserve">4.1 </w:t>
       </w:r>
-      <w:commentRangeStart w:id="7"/>
       <w:r>
         <w:rPr>
           <w:rtl w:val="0"/>
         </w:rPr>
         <w:t xml:space="preserve">Variables previstas</w:t>
       </w:r>
-      <w:commentRangeEnd w:id="7"/>
-      <w:r>
-        <w:commentReference w:id="7"/>
-      </w:r>
+      <w:r/>
       <w:r>
         <w:rPr>
           <w:rtl w:val="0"/>
@@ -2371,20 +2174,7 @@
         </w:rPr>
       </w:pPr>
       <w:r>
-        <w:rPr>
-          <w:i w:val="0"/>
-          <w:iCs w:val="0"/>
-          <w:smallCaps w:val="0"/>
-          <w:strike w:val="0"/>
-          <w:color w:val="000000"/>
-          <w:sz w:val="21"/>
-          <w:szCs w:val="21"/>
-          <w:u w:val="none"/>
-          <w:shd w:fill="auto" w:val="clear"/>
-          <w:vertAlign w:val="baseline"/>
-          <w:rtl w:val="0"/>
-        </w:rPr>
-        <w:t xml:space="preserve">Feature engineering: TF-IDF, embeddings, recuentos de entidades, variables temporales y medidas de longitud.</w:t>
+        <w:t>Feature engineering: TF-IDF, embeddings si procede, recuentos de entidades, variables textuales, variables institucionales y medidas de longitud, siempre definidos dentro del mini caso correspondiente.</w:t>
       </w:r>
     </w:p>
     <w:p>
@@ -2413,31 +2203,7 @@
         </w:rPr>
       </w:pPr>
       <w:r>
-        <w:rPr>
-          <w:i w:val="0"/>
-          <w:iCs w:val="0"/>
-          <w:smallCaps w:val="0"/>
-          <w:strike w:val="0"/>
-          <w:color w:val="000000"/>
-          <w:sz w:val="21"/>
-          <w:szCs w:val="21"/>
-          <w:u w:val="none"/>
-          <w:shd w:fill="auto" w:val="clear"/>
-          <w:vertAlign w:val="baseline"/>
-          <w:rtl w:val="0"/>
-        </w:rPr>
-        <w:t xml:space="preserve">Modelado: clasificación, clustering, grafos </w:t>
-      </w:r>
-      <w:r>
-        <w:rPr>
-          <w:rtl w:val="0"/>
-        </w:rPr>
-        <w:t xml:space="preserve">y buscador semántico.</w:t>
-      </w:r>
-      <w:r>
-        <w:rPr>
-          <w:rtl w:val="0"/>
-        </w:rPr>
+        <w:t>Modelado: clasificación institucional, clustering temático, grafo de entidades, recuperación semántica y generación de fichas documentales.</w:t>
       </w:r>
     </w:p>
     <w:p>
@@ -2714,21 +2480,8 @@
             <w:vAlign w:val="top"/>
           </w:tcPr>
           <w:p>
-            <w:pPr>
-              <w:rPr/>
-            </w:pPr>
             <w:r>
-              <w:rPr>
-                <w:sz w:val="18"/>
-                <w:szCs w:val="18"/>
-                <w:rtl w:val="0"/>
-              </w:rPr>
-              <w:t xml:space="preserve">spaCy, scikit-learn, sentence-transformers</w:t>
-            </w:r>
-            <w:r>
-              <w:rPr>
-                <w:rtl w:val="0"/>
-              </w:rPr>
+              <w:t>spaCy, scikit-learn, sentence-transformers si procede</w:t>
             </w:r>
           </w:p>
         </w:tc>
@@ -2737,21 +2490,8 @@
             <w:vAlign w:val="top"/>
           </w:tcPr>
           <w:p>
-            <w:pPr>
-              <w:rPr/>
-            </w:pPr>
             <w:r>
-              <w:rPr>
-                <w:sz w:val="18"/>
-                <w:szCs w:val="18"/>
-                <w:rtl w:val="0"/>
-              </w:rPr>
-              <w:t xml:space="preserve">Tokenización, NER, TF-IDF y embeddings.</w:t>
-            </w:r>
-            <w:r>
-              <w:rPr>
-                <w:rtl w:val="0"/>
-              </w:rPr>
+              <w:t>Tokenización, NER, TF-IDF, embeddings y recuperación semántica cuando aplique.</w:t>
             </w:r>
           </w:p>
         </w:tc>
@@ -2789,21 +2529,8 @@
             <w:vAlign w:val="top"/>
           </w:tcPr>
           <w:p>
-            <w:pPr>
-              <w:rPr/>
-            </w:pPr>
             <w:r>
-              <w:rPr>
-                <w:sz w:val="18"/>
-                <w:szCs w:val="18"/>
-                <w:rtl w:val="0"/>
-              </w:rPr>
-              <w:t xml:space="preserve">scikit-learn, BERTopic/UMAP si procede</w:t>
-            </w:r>
-            <w:r>
-              <w:rPr>
-                <w:rtl w:val="0"/>
-              </w:rPr>
+              <w:t>scikit-learn; BERTopic/UMAP como extensiones si procede</w:t>
             </w:r>
           </w:p>
         </w:tc>
@@ -2812,21 +2539,8 @@
             <w:vAlign w:val="top"/>
           </w:tcPr>
           <w:p>
-            <w:pPr>
-              <w:rPr/>
-            </w:pPr>
             <w:r>
-              <w:rPr>
-                <w:sz w:val="18"/>
-                <w:szCs w:val="18"/>
-                <w:rtl w:val="0"/>
-              </w:rPr>
-              <w:t xml:space="preserve">Clasificación, clustering y reducción de dimensionalidad.</w:t>
-            </w:r>
-            <w:r>
-              <w:rPr>
-                <w:rtl w:val="0"/>
-              </w:rPr>
+              <w:t>Clasificación institucional, clustering, reducción de dimensionalidad y evaluación.</w:t>
             </w:r>
           </w:p>
         </w:tc>
@@ -2864,21 +2578,8 @@
             <w:vAlign w:val="top"/>
           </w:tcPr>
           <w:p>
-            <w:pPr>
-              <w:rPr/>
-            </w:pPr>
             <w:r>
-              <w:rPr>
-                <w:sz w:val="18"/>
-                <w:szCs w:val="18"/>
-                <w:rtl w:val="0"/>
-              </w:rPr>
-              <w:t xml:space="preserve">NetworkX, PyVis o Gephi</w:t>
-            </w:r>
-            <w:r>
-              <w:rPr>
-                <w:rtl w:val="0"/>
-              </w:rPr>
+              <w:t>NetworkX; PyVis o Gephi si se incorporan visualizaciones interactivas</w:t>
             </w:r>
           </w:p>
         </w:tc>
@@ -2887,21 +2588,8 @@
             <w:vAlign w:val="top"/>
           </w:tcPr>
           <w:p>
-            <w:pPr>
-              <w:rPr/>
-            </w:pPr>
             <w:r>
-              <w:rPr>
-                <w:sz w:val="18"/>
-                <w:szCs w:val="18"/>
-                <w:rtl w:val="0"/>
-              </w:rPr>
-              <w:t xml:space="preserve">Construcción y visualización de redes de coocurrencia.</w:t>
-            </w:r>
-            <w:r>
-              <w:rPr>
-                <w:rtl w:val="0"/>
-              </w:rPr>
+              <w:t>Construcción, análisis y visualización de redes de coocurrencia.</w:t>
             </w:r>
           </w:p>
         </w:tc>
@@ -2939,21 +2627,8 @@
             <w:vAlign w:val="top"/>
           </w:tcPr>
           <w:p>
-            <w:pPr>
-              <w:rPr/>
-            </w:pPr>
             <w:r>
-              <w:rPr>
-                <w:sz w:val="18"/>
-                <w:szCs w:val="18"/>
-                <w:rtl w:val="0"/>
-              </w:rPr>
-              <w:t xml:space="preserve">matplotlib, plotly, Tableau opcional</w:t>
-            </w:r>
-            <w:r>
-              <w:rPr>
-                <w:rtl w:val="0"/>
-              </w:rPr>
+              <w:t>matplotlib, plotly</w:t>
             </w:r>
           </w:p>
         </w:tc>
@@ -2962,21 +2637,8 @@
             <w:vAlign w:val="top"/>
           </w:tcPr>
           <w:p>
-            <w:pPr>
-              <w:rPr/>
-            </w:pPr>
             <w:r>
-              <w:rPr>
-                <w:sz w:val="18"/>
-                <w:szCs w:val="18"/>
-                <w:rtl w:val="0"/>
-              </w:rPr>
-              <w:t xml:space="preserve">Figuras estáticas y exploración interactiva.</w:t>
-            </w:r>
-            <w:r>
-              <w:rPr>
-                <w:rtl w:val="0"/>
-              </w:rPr>
+              <w:t>Figuras estáticas y visualizaciones exploratorias.</w:t>
             </w:r>
           </w:p>
         </w:tc>
@@ -3099,10 +2761,7 @@
         <w:rPr/>
       </w:pPr>
       <w:r>
-        <w:rPr>
-          <w:rtl w:val="0"/>
-        </w:rPr>
-        <w:t xml:space="preserve">6. Análisis exploratorio inicial previsto</w:t>
+        <w:t>6. Análisis exploratorio y limpieza general</w:t>
       </w:r>
     </w:p>
     <w:p>
@@ -3893,15 +3552,7 @@
         <w:rPr/>
       </w:pPr>
       <w:r>
-        <w:rPr>
-          <w:rtl w:val="0"/>
-        </w:rPr>
-        <w:t xml:space="preserve">La propuesta incluye cinco mini casos. Los cuatro primeros cubren el mínimo obligatorio de iniciativas y el quinto añade una aplicación práctica con valor añadido. Todos compartirán el mismo dataset procesado y estarán conectados por un mismo pipeline.</w:t>
-      </w:r>
-      <w:r>
-        <w:rPr>
-          <w:rtl w:val="0"/>
-        </w:rPr>
+        <w:t>La propuesta incluye cinco mini casos conectados por una misma base documental: clasificación institucional, clustering temático, grafo de entidades, asistente documental semántico y generación automática de fichas documentales. El análisis exploratorio y la limpieza general no se tratan como mini caso independiente, sino como fase común previa para justificar la viabilidad y las decisiones metodológicas posteriores.</w:t>
       </w:r>
     </w:p>
     <w:p>
@@ -5092,10 +4743,7 @@
         <w:rPr/>
       </w:pPr>
       <w:r>
-        <w:rPr>
-          <w:rtl w:val="0"/>
-        </w:rPr>
-        <w:t xml:space="preserve">aplicación de algoritmos de clustering (K-Means, HDBSCAN);</w:t>
+        <w:t>aplicación de K-Means como baseline de clustering, con HDBSCAN o BERTopic como posibles extensiones si se completan en la entrega final;</w:t>
       </w:r>
     </w:p>
     <w:p>
@@ -5142,10 +4790,7 @@
         <w:rPr/>
       </w:pPr>
       <w:r>
-        <w:rPr>
-          <w:rtl w:val="0"/>
-        </w:rPr>
-        <w:t xml:space="preserve">visualización en espacios reducidos (PCA o UMAP).</w:t>
+        <w:t>visualización en espacios reducidos mediante PCA o UMAP si se incorpora en la fase final.</w:t>
       </w:r>
     </w:p>
     <w:p>
@@ -5156,18 +4801,20 @@
         </w:rPr>
       </w:pPr>
       <w:r>
-        <w:rPr>
-          <w:rtl w:val="0"/>
-        </w:rPr>
-        <w:t xml:space="preserve">El desarrollo técnico se encuentra detallado en el notebook</w:t>
-      </w:r>
-      <w:r>
+        <w:t>El desarrollo técnico se plantea en el notebook 05_caso_uso2.ipynb.</w:t>
+      </w:r>
+    </w:p>
+    <w:p>
+      <w:pPr>
         <w:rPr>
           <w:b w:val="1"/>
           <w:bCs w:val="1"/>
-          <w:rtl w:val="0"/>
-        </w:rPr>
-        <w:t xml:space="preserve"> 05_caso_uso2.ipynb.</w:t>
+        </w:rPr>
+      </w:pPr>
+      <w:r>
+        <w:rPr>
+          <w:rtl w:val="0"/>
+        </w:rPr>
       </w:r>
     </w:p>
     <w:p>
@@ -5179,147 +4826,147 @@
       </w:pPr>
       <w:r>
         <w:rPr>
-          <w:rtl w:val="0"/>
-        </w:rPr>
-      </w:r>
-    </w:p>
-    <w:p>
-      <w:pPr>
-        <w:rPr>
           <w:b w:val="1"/>
           <w:bCs w:val="1"/>
-        </w:rPr>
-      </w:pPr>
-      <w:r>
+          <w:rtl w:val="0"/>
+        </w:rPr>
+        <w:t xml:space="preserve">6. Riesgos y limitaciones</w:t>
+      </w:r>
+    </w:p>
+    <w:p>
+      <w:pPr>
+        <w:numPr>
+          <w:ilvl w:val="0"/>
+          <w:numId w:val="4"/>
+        </w:numPr>
+        <w:spacing w:after="0" w:afterAutospacing="0"/>
+        <w:ind w:left="720" w:hanging="360"/>
+        <w:rPr/>
+      </w:pPr>
+      <w:r>
+        <w:rPr>
+          <w:rtl w:val="0"/>
+        </w:rPr>
+        <w:t xml:space="preserve">sensibilidad a ruido del OCR;</w:t>
+      </w:r>
+    </w:p>
+    <w:p>
+      <w:pPr>
+        <w:numPr>
+          <w:ilvl w:val="0"/>
+          <w:numId w:val="4"/>
+        </w:numPr>
+        <w:spacing w:after="0" w:afterAutospacing="0"/>
+        <w:ind w:left="720" w:hanging="360"/>
+        <w:rPr/>
+      </w:pPr>
+      <w:r>
+        <w:rPr>
+          <w:rtl w:val="0"/>
+        </w:rPr>
+        <w:t xml:space="preserve">dificultad en la interpretación de clusters;</w:t>
+      </w:r>
+    </w:p>
+    <w:p>
+      <w:pPr>
+        <w:numPr>
+          <w:ilvl w:val="0"/>
+          <w:numId w:val="4"/>
+        </w:numPr>
+        <w:spacing w:after="0" w:afterAutospacing="0"/>
+        <w:ind w:left="720" w:hanging="360"/>
+        <w:rPr/>
+      </w:pPr>
+      <w:r>
+        <w:rPr>
+          <w:rtl w:val="0"/>
+        </w:rPr>
+        <w:t xml:space="preserve">elección del número óptimo de clusters;</w:t>
+      </w:r>
+    </w:p>
+    <w:p>
+      <w:pPr>
+        <w:numPr>
+          <w:ilvl w:val="0"/>
+          <w:numId w:val="4"/>
+        </w:numPr>
+        <w:spacing w:after="0" w:afterAutospacing="0"/>
+        <w:ind w:left="720" w:hanging="360"/>
+        <w:rPr/>
+      </w:pPr>
+      <w:r>
+        <w:rPr>
+          <w:rtl w:val="0"/>
+        </w:rPr>
+        <w:t xml:space="preserve">posible dominancia de documentos largos;</w:t>
+      </w:r>
+    </w:p>
+    <w:p>
+      <w:pPr>
+        <w:numPr>
+          <w:ilvl w:val="0"/>
+          <w:numId w:val="4"/>
+        </w:numPr>
+        <w:ind w:left="720" w:hanging="360"/>
+        <w:rPr/>
+      </w:pPr>
+      <w:r>
+        <w:rPr>
+          <w:rtl w:val="0"/>
+        </w:rPr>
+        <w:t xml:space="preserve">ausencia de ground truth para validación externa.</w:t>
+      </w:r>
+    </w:p>
+    <w:p>
+      <w:pPr>
+        <w:pStyle w:val="Heading2"/>
+        <w:rPr/>
+      </w:pPr>
+      <w:r>
+        <w:rPr>
+          <w:rtl w:val="0"/>
+        </w:rPr>
+        <w:t xml:space="preserve">7.3 Mini caso 3 - Grafo de actores, instituciones y lugares</w:t>
+      </w:r>
+    </w:p>
+    <w:p>
+      <w:pPr>
         <w:rPr>
           <w:b w:val="1"/>
           <w:bCs w:val="1"/>
-          <w:rtl w:val="0"/>
-        </w:rPr>
-        <w:t xml:space="preserve">6. Riesgos y limitaciones</w:t>
-      </w:r>
-    </w:p>
-    <w:p>
-      <w:pPr>
-        <w:numPr>
-          <w:ilvl w:val="0"/>
-          <w:numId w:val="4"/>
-        </w:numPr>
-        <w:spacing w:after="0" w:afterAutospacing="0"/>
-        <w:ind w:left="720" w:hanging="360"/>
-        <w:rPr/>
-      </w:pPr>
-      <w:r>
-        <w:rPr>
-          <w:rtl w:val="0"/>
-        </w:rPr>
-        <w:t xml:space="preserve">sensibilidad a ruido del OCR;</w:t>
-      </w:r>
-    </w:p>
-    <w:p>
-      <w:pPr>
-        <w:numPr>
-          <w:ilvl w:val="0"/>
-          <w:numId w:val="4"/>
-        </w:numPr>
-        <w:spacing w:after="0" w:afterAutospacing="0"/>
-        <w:ind w:left="720" w:hanging="360"/>
-        <w:rPr/>
-      </w:pPr>
-      <w:r>
-        <w:rPr>
-          <w:rtl w:val="0"/>
-        </w:rPr>
-        <w:t xml:space="preserve">dificultad en la interpretación de clusters;</w:t>
-      </w:r>
-    </w:p>
-    <w:p>
-      <w:pPr>
-        <w:numPr>
-          <w:ilvl w:val="0"/>
-          <w:numId w:val="4"/>
-        </w:numPr>
-        <w:spacing w:after="0" w:afterAutospacing="0"/>
-        <w:ind w:left="720" w:hanging="360"/>
-        <w:rPr/>
-      </w:pPr>
-      <w:r>
-        <w:rPr>
-          <w:rtl w:val="0"/>
-        </w:rPr>
-        <w:t xml:space="preserve">elección del número óptimo de clusters;</w:t>
-      </w:r>
-    </w:p>
-    <w:p>
-      <w:pPr>
-        <w:numPr>
-          <w:ilvl w:val="0"/>
-          <w:numId w:val="4"/>
-        </w:numPr>
-        <w:spacing w:after="0" w:afterAutospacing="0"/>
-        <w:ind w:left="720" w:hanging="360"/>
-        <w:rPr/>
-      </w:pPr>
-      <w:r>
-        <w:rPr>
-          <w:rtl w:val="0"/>
-        </w:rPr>
-        <w:t xml:space="preserve">posible dominancia de documentos largos;</w:t>
-      </w:r>
-    </w:p>
-    <w:p>
-      <w:pPr>
-        <w:numPr>
-          <w:ilvl w:val="0"/>
-          <w:numId w:val="4"/>
-        </w:numPr>
-        <w:ind w:left="720" w:hanging="360"/>
-        <w:rPr/>
-      </w:pPr>
-      <w:r>
-        <w:rPr>
-          <w:rtl w:val="0"/>
-        </w:rPr>
-        <w:t xml:space="preserve">ausencia de ground truth para validación externa.</w:t>
-      </w:r>
-    </w:p>
-    <w:p>
-      <w:pPr>
-        <w:pStyle w:val="Heading2"/>
-        <w:rPr/>
-      </w:pPr>
-      <w:r>
-        <w:rPr>
-          <w:rtl w:val="0"/>
-        </w:rPr>
-        <w:t xml:space="preserve">7.3 Mini caso 3 - Grafo de actores, instituciones y lugares</w:t>
-      </w:r>
-    </w:p>
-    <w:p>
-      <w:pPr>
+        </w:rPr>
+      </w:pPr>
+      <w:r>
         <w:rPr>
           <w:b w:val="1"/>
           <w:bCs w:val="1"/>
-        </w:rPr>
-      </w:pPr>
-      <w:r>
+          <w:rtl w:val="0"/>
+        </w:rPr>
+        <w:t xml:space="preserve">1. Objetivo del mini caso</w:t>
+      </w:r>
+    </w:p>
+    <w:p>
+      <w:pPr>
+        <w:rPr/>
+      </w:pPr>
+      <w:r>
+        <w:rPr>
+          <w:rtl w:val="0"/>
+        </w:rPr>
+        <w:t xml:space="preserve">El objetivo es construir un grafo de relaciones entre entidades (personas, instituciones y lugares) extraídas del corpus, con el fin de analizar la estructura relacional del contexto histórico del 23-F.</w:t>
+      </w:r>
+    </w:p>
+    <w:p>
+      <w:pPr>
         <w:rPr>
           <w:b w:val="1"/>
           <w:bCs w:val="1"/>
-          <w:rtl w:val="0"/>
-        </w:rPr>
-        <w:t xml:space="preserve">1. Objetivo del mini caso</w:t>
-      </w:r>
-    </w:p>
-    <w:p>
-      <w:pPr>
-        <w:rPr/>
-      </w:pPr>
-      <w:r>
-        <w:rPr>
-          <w:rtl w:val="0"/>
-        </w:rPr>
-        <w:t xml:space="preserve">El objetivo es construir un grafo de relaciones entre entidades (personas, instituciones y lugares) extraídas del corpus, con el fin de analizar la estructura relacional del contexto histórico del 23-F.</w:t>
+        </w:rPr>
+      </w:pPr>
+      <w:r>
+        <w:rPr>
+          <w:rtl w:val="0"/>
+        </w:rPr>
       </w:r>
     </w:p>
     <w:p>
@@ -5331,24 +4978,97 @@
       </w:pPr>
       <w:r>
         <w:rPr>
-          <w:rtl w:val="0"/>
-        </w:rPr>
-      </w:r>
-    </w:p>
-    <w:p>
-      <w:pPr>
-        <w:rPr>
           <w:b w:val="1"/>
           <w:bCs w:val="1"/>
-        </w:rPr>
-      </w:pPr>
-      <w:r>
+          <w:rtl w:val="0"/>
+        </w:rPr>
+        <w:t xml:space="preserve">2. Justificación</w:t>
+      </w:r>
+    </w:p>
+    <w:p>
+      <w:pPr>
         <w:rPr>
           <w:b w:val="1"/>
           <w:bCs w:val="1"/>
-          <w:rtl w:val="0"/>
-        </w:rPr>
-        <w:t xml:space="preserve">2. Justificación</w:t>
+        </w:rPr>
+      </w:pPr>
+      <w:r>
+        <w:rPr>
+          <w:rtl w:val="0"/>
+        </w:rPr>
+        <w:t xml:space="preserve">El dataset contiene una gran cantidad de información sobre actores relevantes. Modelar estas relaciones mediante grafos permite:</w:t>
+      </w:r>
+      <w:r>
+        <w:rPr>
+          <w:rtl w:val="0"/>
+        </w:rPr>
+      </w:r>
+    </w:p>
+    <w:p>
+      <w:pPr>
+        <w:numPr>
+          <w:ilvl w:val="0"/>
+          <w:numId w:val="20"/>
+        </w:numPr>
+        <w:spacing w:after="0" w:afterAutospacing="0"/>
+        <w:ind w:left="720" w:hanging="360"/>
+        <w:rPr>
+          <w:u w:val="none"/>
+        </w:rPr>
+      </w:pPr>
+      <w:r>
+        <w:rPr>
+          <w:rtl w:val="0"/>
+        </w:rPr>
+        <w:t xml:space="preserve">identificar actores centrales;</w:t>
+      </w:r>
+    </w:p>
+    <w:p>
+      <w:pPr>
+        <w:numPr>
+          <w:ilvl w:val="0"/>
+          <w:numId w:val="20"/>
+        </w:numPr>
+        <w:spacing w:after="0" w:afterAutospacing="0"/>
+        <w:ind w:left="720" w:hanging="360"/>
+        <w:rPr>
+          <w:u w:val="none"/>
+        </w:rPr>
+      </w:pPr>
+      <w:r>
+        <w:rPr>
+          <w:rtl w:val="0"/>
+        </w:rPr>
+        <w:t xml:space="preserve">analizar redes de poder;</w:t>
+      </w:r>
+    </w:p>
+    <w:p>
+      <w:pPr>
+        <w:numPr>
+          <w:ilvl w:val="0"/>
+          <w:numId w:val="20"/>
+        </w:numPr>
+        <w:ind w:left="720" w:hanging="360"/>
+        <w:rPr>
+          <w:u w:val="none"/>
+        </w:rPr>
+      </w:pPr>
+      <w:r>
+        <w:rPr>
+          <w:rtl w:val="0"/>
+        </w:rPr>
+        <w:t xml:space="preserve">descubrir conexiones no evidentes entre documentos.</w:t>
+      </w:r>
+    </w:p>
+    <w:p>
+      <w:pPr>
+        <w:ind w:left="720" w:firstLine="0"/>
+        <w:rPr/>
+      </w:pPr>
+      <w:r>
+        <w:rPr>
+          <w:rtl w:val="0"/>
+        </w:rPr>
       </w:r>
     </w:p>
     <w:p>
@@ -5360,97 +5080,108 @@
       </w:pPr>
       <w:r>
         <w:rPr>
-          <w:rtl w:val="0"/>
-        </w:rPr>
-        <w:t xml:space="preserve">El dataset contiene una gran cantidad de información sobre actores relevantes. Modelar estas relaciones mediante grafos permite:</w:t>
-      </w:r>
-      <w:r>
-        <w:rPr>
-          <w:rtl w:val="0"/>
-        </w:rPr>
-      </w:r>
-    </w:p>
-    <w:p>
-      <w:pPr>
-        <w:numPr>
-          <w:ilvl w:val="0"/>
-          <w:numId w:val="20"/>
-        </w:numPr>
-        <w:spacing w:after="0" w:afterAutospacing="0"/>
-        <w:ind w:left="720" w:hanging="360"/>
-        <w:rPr>
-          <w:u w:val="none"/>
-        </w:rPr>
-      </w:pPr>
-      <w:r>
-        <w:rPr>
-          <w:rtl w:val="0"/>
-        </w:rPr>
-        <w:t xml:space="preserve">identificar actores centrales;</w:t>
-      </w:r>
-    </w:p>
-    <w:p>
-      <w:pPr>
-        <w:numPr>
-          <w:ilvl w:val="0"/>
-          <w:numId w:val="20"/>
-        </w:numPr>
-        <w:spacing w:after="0" w:afterAutospacing="0"/>
-        <w:ind w:left="720" w:hanging="360"/>
-        <w:rPr>
-          <w:u w:val="none"/>
-        </w:rPr>
-      </w:pPr>
-      <w:r>
-        <w:rPr>
-          <w:rtl w:val="0"/>
-        </w:rPr>
-        <w:t xml:space="preserve">analizar redes de poder;</w:t>
-      </w:r>
-    </w:p>
-    <w:p>
-      <w:pPr>
-        <w:numPr>
-          <w:ilvl w:val="0"/>
-          <w:numId w:val="20"/>
-        </w:numPr>
-        <w:ind w:left="720" w:hanging="360"/>
-        <w:rPr>
-          <w:u w:val="none"/>
-        </w:rPr>
-      </w:pPr>
-      <w:r>
-        <w:rPr>
-          <w:rtl w:val="0"/>
-        </w:rPr>
-        <w:t xml:space="preserve">descubrir conexiones no evidentes entre documentos.</w:t>
-      </w:r>
-    </w:p>
-    <w:p>
-      <w:pPr>
-        <w:ind w:left="720" w:firstLine="0"/>
-        <w:rPr/>
-      </w:pPr>
-      <w:r>
-        <w:rPr>
-          <w:rtl w:val="0"/>
-        </w:rPr>
-      </w:r>
-    </w:p>
-    <w:p>
-      <w:pPr>
-        <w:rPr>
           <w:b w:val="1"/>
           <w:bCs w:val="1"/>
-        </w:rPr>
-      </w:pPr>
-      <w:r>
+          <w:rtl w:val="0"/>
+        </w:rPr>
+        <w:t xml:space="preserve">3. Datos necesarios</w:t>
+      </w:r>
+    </w:p>
+    <w:p>
+      <w:pPr>
         <w:rPr>
           <w:b w:val="1"/>
           <w:bCs w:val="1"/>
-          <w:rtl w:val="0"/>
-        </w:rPr>
-        <w:t xml:space="preserve">3. Datos necesarios</w:t>
+        </w:rPr>
+      </w:pPr>
+      <w:r>
+        <w:rPr>
+          <w:rtl w:val="0"/>
+        </w:rPr>
+        <w:t xml:space="preserve">Se utilizan:</w:t>
+      </w:r>
+      <w:r>
+        <w:rPr>
+          <w:rtl w:val="0"/>
+        </w:rPr>
+      </w:r>
+    </w:p>
+    <w:p>
+      <w:pPr>
+        <w:numPr>
+          <w:ilvl w:val="0"/>
+          <w:numId w:val="19"/>
+        </w:numPr>
+        <w:spacing w:after="0" w:afterAutospacing="0"/>
+        <w:ind w:left="720" w:hanging="360"/>
+        <w:rPr/>
+      </w:pPr>
+      <w:r>
+        <w:rPr>
+          <w:rtl w:val="0"/>
+        </w:rPr>
+        <w:t xml:space="preserve">text_clean_base como fuente textual;</w:t>
+      </w:r>
+    </w:p>
+    <w:p>
+      <w:pPr>
+        <w:numPr>
+          <w:ilvl w:val="0"/>
+          <w:numId w:val="19"/>
+        </w:numPr>
+        <w:spacing w:after="0" w:afterAutospacing="0"/>
+        <w:ind w:left="720" w:hanging="360"/>
+        <w:rPr/>
+      </w:pPr>
+      <w:r>
+        <w:rPr>
+          <w:rtl w:val="0"/>
+        </w:rPr>
+        <w:t xml:space="preserve">doc_id para trazabilidad;</w:t>
+      </w:r>
+    </w:p>
+    <w:p>
+      <w:pPr>
+        <w:numPr>
+          <w:ilvl w:val="0"/>
+          <w:numId w:val="19"/>
+        </w:numPr>
+        <w:spacing w:after="0" w:afterAutospacing="0"/>
+        <w:ind w:left="720" w:hanging="360"/>
+        <w:rPr/>
+      </w:pPr>
+      <w:r>
+        <w:rPr>
+          <w:rtl w:val="0"/>
+        </w:rPr>
+        <w:t xml:space="preserve">entidades extraídas mediante técnicas de NLP;</w:t>
+      </w:r>
+    </w:p>
+    <w:p>
+      <w:pPr>
+        <w:numPr>
+          <w:ilvl w:val="0"/>
+          <w:numId w:val="19"/>
+        </w:numPr>
+        <w:ind w:left="720" w:hanging="360"/>
+        <w:rPr/>
+      </w:pPr>
+      <w:r>
+        <w:rPr>
+          <w:rtl w:val="0"/>
+        </w:rPr>
+        <w:t xml:space="preserve">opcionalmente metadatos institucionales para enriquecer el análisis.</w:t>
+      </w:r>
+    </w:p>
+    <w:p>
+      <w:pPr>
+        <w:ind w:left="720" w:firstLine="0"/>
+        <w:rPr/>
+      </w:pPr>
+      <w:r>
+        <w:rPr>
+          <w:rtl w:val="0"/>
+        </w:rPr>
       </w:r>
     </w:p>
     <w:p>
@@ -5462,130 +5193,46 @@
       </w:pPr>
       <w:r>
         <w:rPr>
-          <w:rtl w:val="0"/>
-        </w:rPr>
-        <w:t xml:space="preserve">Se utilizan:</w:t>
-      </w:r>
-      <w:r>
-        <w:rPr>
-          <w:rtl w:val="0"/>
-        </w:rPr>
-      </w:r>
-    </w:p>
-    <w:p>
-      <w:pPr>
-        <w:numPr>
-          <w:ilvl w:val="0"/>
-          <w:numId w:val="19"/>
-        </w:numPr>
-        <w:spacing w:after="0" w:afterAutospacing="0"/>
-        <w:ind w:left="720" w:hanging="360"/>
-        <w:rPr/>
-      </w:pPr>
-      <w:r>
-        <w:rPr>
-          <w:rtl w:val="0"/>
-        </w:rPr>
-        <w:t xml:space="preserve">text_clean_base como fuente textual;</w:t>
-      </w:r>
-    </w:p>
-    <w:p>
-      <w:pPr>
-        <w:numPr>
-          <w:ilvl w:val="0"/>
-          <w:numId w:val="19"/>
-        </w:numPr>
-        <w:spacing w:after="0" w:afterAutospacing="0"/>
-        <w:ind w:left="720" w:hanging="360"/>
-        <w:rPr/>
-      </w:pPr>
-      <w:r>
-        <w:rPr>
-          <w:rtl w:val="0"/>
-        </w:rPr>
-        <w:t xml:space="preserve">doc_id para trazabilidad;</w:t>
-      </w:r>
-    </w:p>
-    <w:p>
-      <w:pPr>
-        <w:numPr>
-          <w:ilvl w:val="0"/>
-          <w:numId w:val="19"/>
-        </w:numPr>
-        <w:spacing w:after="0" w:afterAutospacing="0"/>
-        <w:ind w:left="720" w:hanging="360"/>
-        <w:rPr/>
-      </w:pPr>
-      <w:r>
-        <w:rPr>
-          <w:rtl w:val="0"/>
-        </w:rPr>
-        <w:t xml:space="preserve">entidades extraídas mediante técnicas de NLP;</w:t>
-      </w:r>
-    </w:p>
-    <w:p>
-      <w:pPr>
-        <w:numPr>
-          <w:ilvl w:val="0"/>
-          <w:numId w:val="19"/>
-        </w:numPr>
-        <w:ind w:left="720" w:hanging="360"/>
-        <w:rPr/>
-      </w:pPr>
-      <w:r>
-        <w:rPr>
-          <w:rtl w:val="0"/>
-        </w:rPr>
-        <w:t xml:space="preserve">opcionalmente metadatos institucionales para enriquecer el análisis.</w:t>
-      </w:r>
-    </w:p>
-    <w:p>
-      <w:pPr>
-        <w:ind w:left="720" w:firstLine="0"/>
-        <w:rPr/>
-      </w:pPr>
-      <w:r>
-        <w:rPr>
-          <w:rtl w:val="0"/>
-        </w:rPr>
-      </w:r>
-    </w:p>
-    <w:p>
-      <w:pPr>
-        <w:rPr>
           <w:b w:val="1"/>
           <w:bCs w:val="1"/>
-        </w:rPr>
-      </w:pPr>
-      <w:r>
+          <w:rtl w:val="0"/>
+        </w:rPr>
+        <w:t xml:space="preserve">4. Validación de viabilidad</w:t>
+      </w:r>
+    </w:p>
+    <w:p>
+      <w:pPr>
+        <w:rPr/>
+      </w:pPr>
+      <w:r>
+        <w:rPr>
+          <w:rtl w:val="0"/>
+        </w:rPr>
+        <w:t xml:space="preserve">El corpus presenta una fuerte señal en términos de entidades (nombres propios, instituciones, cargos), como se observó en el EDA. Esto permite aplicar técnicas de reconocimiento de entidades (NER).</w:t>
+      </w:r>
+    </w:p>
+    <w:p>
+      <w:pPr>
+        <w:rPr/>
+      </w:pPr>
+      <w:r>
+        <w:rPr>
+          <w:rtl w:val="0"/>
+        </w:rPr>
+        <w:t xml:space="preserve">El problema es exploratorio, sin necesidad de etiquetas previas.</w:t>
+      </w:r>
+    </w:p>
+    <w:p>
+      <w:pPr>
         <w:rPr>
           <w:b w:val="1"/>
           <w:bCs w:val="1"/>
-          <w:rtl w:val="0"/>
-        </w:rPr>
-        <w:t xml:space="preserve">4. Validación de viabilidad</w:t>
-      </w:r>
-    </w:p>
-    <w:p>
-      <w:pPr>
-        <w:rPr/>
-      </w:pPr>
-      <w:r>
-        <w:rPr>
-          <w:rtl w:val="0"/>
-        </w:rPr>
-        <w:t xml:space="preserve">El corpus presenta una fuerte señal en términos de entidades (nombres propios, instituciones, cargos), como se observó en el EDA. Esto permite aplicar técnicas de reconocimiento de entidades (NER).</w:t>
-      </w:r>
-    </w:p>
-    <w:p>
-      <w:pPr>
-        <w:rPr/>
-      </w:pPr>
-      <w:r>
-        <w:rPr>
-          <w:rtl w:val="0"/>
-        </w:rPr>
-        <w:t xml:space="preserve">El problema es exploratorio, sin necesidad de etiquetas previas.</w:t>
+        </w:rPr>
+      </w:pPr>
+      <w:r>
+        <w:rPr>
+          <w:rtl w:val="0"/>
+        </w:rPr>
       </w:r>
     </w:p>
     <w:p>
@@ -5597,24 +5244,125 @@
       </w:pPr>
       <w:r>
         <w:rPr>
-          <w:rtl w:val="0"/>
-        </w:rPr>
-      </w:r>
-    </w:p>
-    <w:p>
-      <w:pPr>
-        <w:rPr>
           <w:b w:val="1"/>
           <w:bCs w:val="1"/>
-        </w:rPr>
-      </w:pPr>
-      <w:r>
+          <w:rtl w:val="0"/>
+        </w:rPr>
+        <w:t xml:space="preserve">5. Metodología propuesta</w:t>
+      </w:r>
+    </w:p>
+    <w:p>
+      <w:pPr>
         <w:rPr>
           <w:b w:val="1"/>
           <w:bCs w:val="1"/>
-          <w:rtl w:val="0"/>
-        </w:rPr>
-        <w:t xml:space="preserve">5. Metodología propuesta</w:t>
+        </w:rPr>
+      </w:pPr>
+      <w:r>
+        <w:rPr>
+          <w:rtl w:val="0"/>
+        </w:rPr>
+        <w:t xml:space="preserve">El flujo planteado es:</w:t>
+      </w:r>
+      <w:r>
+        <w:rPr>
+          <w:rtl w:val="0"/>
+        </w:rPr>
+      </w:r>
+    </w:p>
+    <w:p>
+      <w:pPr>
+        <w:numPr>
+          <w:ilvl w:val="0"/>
+          <w:numId w:val="22"/>
+        </w:numPr>
+        <w:spacing w:after="0" w:afterAutospacing="0"/>
+        <w:ind w:left="720" w:hanging="360"/>
+        <w:rPr/>
+      </w:pPr>
+      <w:r>
+        <w:rPr>
+          <w:rtl w:val="0"/>
+        </w:rPr>
+        <w:t xml:space="preserve">extracción de entidades mediante modelos NLP;</w:t>
+      </w:r>
+    </w:p>
+    <w:p>
+      <w:pPr>
+        <w:numPr>
+          <w:ilvl w:val="0"/>
+          <w:numId w:val="22"/>
+        </w:numPr>
+        <w:spacing w:after="0" w:afterAutospacing="0"/>
+        <w:ind w:left="720" w:hanging="360"/>
+        <w:rPr/>
+      </w:pPr>
+      <w:r>
+        <w:rPr>
+          <w:rtl w:val="0"/>
+        </w:rPr>
+        <w:t xml:space="preserve">filtrado por tipo (persona, organización, localización);</w:t>
+      </w:r>
+    </w:p>
+    <w:p>
+      <w:pPr>
+        <w:numPr>
+          <w:ilvl w:val="0"/>
+          <w:numId w:val="22"/>
+        </w:numPr>
+        <w:spacing w:after="0" w:afterAutospacing="0"/>
+        <w:ind w:left="720" w:hanging="360"/>
+        <w:rPr/>
+      </w:pPr>
+      <w:r>
+        <w:rPr>
+          <w:rtl w:val="0"/>
+        </w:rPr>
+        <w:t xml:space="preserve">construcción de relaciones basadas en co-ocurrencia;</w:t>
+      </w:r>
+    </w:p>
+    <w:p>
+      <w:pPr>
+        <w:numPr>
+          <w:ilvl w:val="0"/>
+          <w:numId w:val="22"/>
+        </w:numPr>
+        <w:spacing w:after="0" w:afterAutospacing="0"/>
+        <w:ind w:left="720" w:hanging="360"/>
+        <w:rPr/>
+      </w:pPr>
+      <w:r>
+        <w:rPr>
+          <w:rtl w:val="0"/>
+        </w:rPr>
+        <w:t xml:space="preserve">generación de un grafo con NetworkX;</w:t>
+      </w:r>
+    </w:p>
+    <w:p>
+      <w:pPr>
+        <w:numPr>
+          <w:ilvl w:val="0"/>
+          <w:numId w:val="22"/>
+        </w:numPr>
+        <w:spacing w:after="0" w:afterAutospacing="0"/>
+        <w:ind w:left="720" w:hanging="360"/>
+        <w:rPr/>
+      </w:pPr>
+      <w:r>
+        <w:t>análisis básico de centralidad, dejando la detección de comunidades como posible extensión si el grafo resultante lo permite;</w:t>
+      </w:r>
+    </w:p>
+    <w:p>
+      <w:pPr>
+        <w:numPr>
+          <w:ilvl w:val="0"/>
+          <w:numId w:val="22"/>
+        </w:numPr>
+        <w:ind w:left="720" w:hanging="360"/>
+        <w:rPr/>
+      </w:pPr>
+      <w:r>
+        <w:t>visualización exploratoria del grafo.</w:t>
       </w:r>
     </w:p>
     <w:p>
@@ -5625,143 +5373,7 @@
         </w:rPr>
       </w:pPr>
       <w:r>
-        <w:rPr>
-          <w:rtl w:val="0"/>
-        </w:rPr>
-        <w:t xml:space="preserve">El flujo planteado es:</w:t>
-      </w:r>
-      <w:r>
-        <w:rPr>
-          <w:rtl w:val="0"/>
-        </w:rPr>
-      </w:r>
-    </w:p>
-    <w:p>
-      <w:pPr>
-        <w:numPr>
-          <w:ilvl w:val="0"/>
-          <w:numId w:val="22"/>
-        </w:numPr>
-        <w:spacing w:after="0" w:afterAutospacing="0"/>
-        <w:ind w:left="720" w:hanging="360"/>
-        <w:rPr/>
-      </w:pPr>
-      <w:r>
-        <w:rPr>
-          <w:rtl w:val="0"/>
-        </w:rPr>
-        <w:t xml:space="preserve">extracción de entidades mediante modelos NLP;</w:t>
-      </w:r>
-    </w:p>
-    <w:p>
-      <w:pPr>
-        <w:numPr>
-          <w:ilvl w:val="0"/>
-          <w:numId w:val="22"/>
-        </w:numPr>
-        <w:spacing w:after="0" w:afterAutospacing="0"/>
-        <w:ind w:left="720" w:hanging="360"/>
-        <w:rPr/>
-      </w:pPr>
-      <w:r>
-        <w:rPr>
-          <w:rtl w:val="0"/>
-        </w:rPr>
-        <w:t xml:space="preserve">filtrado por tipo (persona, organización, localización);</w:t>
-      </w:r>
-    </w:p>
-    <w:p>
-      <w:pPr>
-        <w:numPr>
-          <w:ilvl w:val="0"/>
-          <w:numId w:val="22"/>
-        </w:numPr>
-        <w:spacing w:after="0" w:afterAutospacing="0"/>
-        <w:ind w:left="720" w:hanging="360"/>
-        <w:rPr/>
-      </w:pPr>
-      <w:r>
-        <w:rPr>
-          <w:rtl w:val="0"/>
-        </w:rPr>
-        <w:t xml:space="preserve">construcción de relaciones basadas en co-ocurrencia;</w:t>
-      </w:r>
-    </w:p>
-    <w:p>
-      <w:pPr>
-        <w:numPr>
-          <w:ilvl w:val="0"/>
-          <w:numId w:val="22"/>
-        </w:numPr>
-        <w:spacing w:after="0" w:afterAutospacing="0"/>
-        <w:ind w:left="720" w:hanging="360"/>
-        <w:rPr/>
-      </w:pPr>
-      <w:r>
-        <w:rPr>
-          <w:rtl w:val="0"/>
-        </w:rPr>
-        <w:t xml:space="preserve">generación de un grafo con NetworkX;</w:t>
-      </w:r>
-    </w:p>
-    <w:p>
-      <w:pPr>
-        <w:numPr>
-          <w:ilvl w:val="0"/>
-          <w:numId w:val="22"/>
-        </w:numPr>
-        <w:spacing w:after="0" w:afterAutospacing="0"/>
-        <w:ind w:left="720" w:hanging="360"/>
-        <w:rPr/>
-      </w:pPr>
-      <w:r>
-        <w:rPr>
-          <w:rtl w:val="0"/>
-        </w:rPr>
-        <w:t xml:space="preserve">análisis de centralidad y comunidades;</w:t>
-      </w:r>
-    </w:p>
-    <w:p>
-      <w:pPr>
-        <w:numPr>
-          <w:ilvl w:val="0"/>
-          <w:numId w:val="22"/>
-        </w:numPr>
-        <w:ind w:left="720" w:hanging="360"/>
-        <w:rPr/>
-      </w:pPr>
-      <w:r>
-        <w:rPr>
-          <w:rtl w:val="0"/>
-        </w:rPr>
-        <w:t xml:space="preserve">visualización del grafo.</w:t>
-      </w:r>
-      <w:r>
-        <w:rPr>
-          <w:rtl w:val="0"/>
-        </w:rPr>
-      </w:r>
-    </w:p>
-    <w:p>
-      <w:pPr>
-        <w:rPr>
-          <w:b w:val="1"/>
-          <w:bCs w:val="1"/>
-        </w:rPr>
-      </w:pPr>
-      <w:r>
-        <w:rPr>
-          <w:rtl w:val="0"/>
-        </w:rPr>
-        <w:t xml:space="preserve">El detalle de implementación se encuentra en el notebook </w:t>
-      </w:r>
-      <w:r>
-        <w:rPr>
-          <w:b w:val="1"/>
-          <w:bCs w:val="1"/>
-          <w:rtl w:val="0"/>
-        </w:rPr>
-        <w:t xml:space="preserve">06_caso_uso3.ipynb.</w:t>
+        <w:t>El desarrollo técnico se plantea en el notebook 06_caso_uso3.ipynb.</w:t>
       </w:r>
     </w:p>
     <w:p>
@@ -6019,10 +5631,7 @@
         <w:rPr/>
       </w:pPr>
       <w:r>
-        <w:rPr>
-          <w:rtl w:val="0"/>
-        </w:rPr>
-        <w:t xml:space="preserve">Además, este mini caso aporta una aplicación práctica vinculada a NLP y GenAI, ya que puede evolucionar hacia un sistema tipo RAG siempre que las respuestas se basen exclusivamente en evidencias recuperadas del corpus.</w:t>
+        <w:t>Además, este mini caso aporta una aplicación práctica vinculada a NLP y recuperación de información. Puede evolucionar hacia un sistema tipo RAG solo si las respuestas se basan exclusivamente en evidencias recuperadas del corpus.</w:t>
       </w:r>
     </w:p>
     <w:p>
@@ -8858,46 +8467,23 @@
         <w:rPr/>
       </w:pPr>
       <w:r>
-        <w:rPr>
-          <w:rtl w:val="0"/>
-        </w:rPr>
-        <w:t xml:space="preserve">9.</w:t>
-      </w:r>
-      <w:r>
-        <w:rPr>
-          <w:rtl w:val="0"/>
-        </w:rPr>
-        <w:t xml:space="preserve"> Conclusiones de la entrega parcial</w:t>
-      </w:r>
-    </w:p>
-    <w:p>
-      <w:pPr>
-        <w:rPr/>
-      </w:pPr>
-      <w:r>
-        <w:rPr>
-          <w:rtl w:val="0"/>
-        </w:rPr>
-        <w:t xml:space="preserve">La propuesta presentada cumple el objetivo de la entrega intermedia: define una estructura clara del trabajo, describe las iniciativas de análisis y concreta cómo se abordará cada mini caso. El proyecto se plantea como una investigación documental apoyada en Machine Learning, con especial énfasis en la reproducibilidad, la interpretación y la utilidad práctica.</w:t>
-      </w:r>
-    </w:p>
-    <w:p>
-      <w:pPr>
-        <w:rPr/>
-      </w:pPr>
-      <w:r>
-        <w:rPr>
-          <w:rtl w:val="0"/>
-        </w:rPr>
-        <w:t xml:space="preserve">La combinación de EDA, clasificación, clustering, grafos, análisis temporal y búsqueda semántica permite cubrir distintas áreas de conocimiento y construir una narrativa sólida sobre el corpus. La fase siguiente consistirá en consolidar el dataset procesado, ejecutar los modelos, evaluar resultados y transformar los hallazgos en un informe final claro y defendible.</w:t>
-      </w:r>
-      <w:r>
-        <w:br w:type="page"/>
-      </w:r>
-      <w:r>
-        <w:rPr>
-          <w:rtl w:val="0"/>
-        </w:rPr>
+        <w:t>9. Conclusiones de la entrega parcial</w:t>
+      </w:r>
+    </w:p>
+    <w:p>
+      <w:pPr>
+        <w:rPr/>
+      </w:pPr>
+      <w:r>
+        <w:t>La entrega parcial consolida una estructura clara de trabajo, una base documental trazable y una primera validación metodológica de los mini casos. El proyecto se plantea como una investigación documental apoyada en Machine Learning y NLP, con especial énfasis en reproducibilidad, interpretación y utilidad práctica.</w:t>
+      </w:r>
+    </w:p>
+    <w:p>
+      <w:pPr>
+        <w:rPr/>
+      </w:pPr>
+      <w:r>
+        <w:t>La combinación de EDA, limpieza conservadora, clasificación institucional, clustering temático, grafos de entidades, recuperación semántica y fichas documentales permite cubrir distintas áreas de conocimiento y construir una narrativa sólida sobre el corpus. La fase siguiente consistirá en completar los mini casos, evaluar sus resultados y transformar los hallazgos en un informe final claro y defendible.</w:t>
       </w:r>
     </w:p>
     <w:p>
@@ -8916,10 +8502,7 @@
         <w:rPr/>
       </w:pPr>
       <w:r>
-        <w:rPr>
-          <w:rtl w:val="0"/>
-        </w:rPr>
-        <w:t xml:space="preserve">10. Referencias</w:t>
+        <w:t>10. Referencias</w:t>
       </w:r>
     </w:p>
     <w:p>
@@ -9274,15 +8857,7 @@
         </w:rPr>
       </w:pPr>
       <w:r>
-        <w:rPr>
-          <w:rtl w:val="0"/>
-        </w:rPr>
-        <w:t xml:space="preserve">11. Anexos</w:t>
-      </w:r>
-      <w:r>
-        <w:rPr>
-          <w:rtl w:val="0"/>
-        </w:rPr>
+        <w:t>11. Anexos</w:t>
       </w:r>
     </w:p>
     <w:p>
@@ -9291,42 +8866,29 @@
         <w:rPr/>
       </w:pPr>
       <w:r>
-        <w:rPr>
-          <w:rtl w:val="0"/>
-        </w:rPr>
-        <w:t xml:space="preserve">Anexo A - Estructura del respositorio</w:t>
-      </w:r>
-    </w:p>
-    <w:p>
-      <w:pPr>
-        <w:rPr/>
-      </w:pPr>
-      <w:r>
-        <w:rPr>
-          <w:sz w:val="15"/>
-          <w:szCs w:val="15"/>
-          <w:rtl w:val="0"/>
-        </w:rPr>
-        <w:t xml:space="preserve">proyecto-ml-23f/</w:t>
-        <w:br w:type="textWrapping"/>
-        <w:t xml:space="preserve">|-- README.md</w:t>
-        <w:br w:type="textWrapping"/>
-        <w:t xml:space="preserve">|-- requirements.txt</w:t>
-        <w:br w:type="textWrapping"/>
-        <w:t xml:space="preserve">|-- notebooks/</w:t>
-        <w:br w:type="textWrapping"/>
-        <w:t xml:space="preserve">|-- src/</w:t>
-        <w:br w:type="textWrapping"/>
-        <w:t xml:space="preserve">|-- data/      (raw/, interim/, processed/)</w:t>
-        <w:br w:type="textWrapping"/>
-        <w:t xml:space="preserve">|-- outputs/   (figures/, tables/, models/)</w:t>
-        <w:br w:type="textWrapping"/>
-        <w:t xml:space="preserve">`-- docs/      (informe_intermedio.pdf, informe_final.pdf)</w:t>
-      </w:r>
-      <w:r>
-        <w:rPr>
-          <w:rtl w:val="0"/>
-        </w:rPr>
+        <w:t>Anexo A - Estructura del repositorio</w:t>
+      </w:r>
+    </w:p>
+    <w:p>
+      <w:pPr>
+        <w:rPr/>
+      </w:pPr>
+      <w:r>
+        <w:t>proyecto-ml-23f/</w:t>
+        <w:br/>
+        <w:t>|-- README.md</w:t>
+        <w:br/>
+        <w:t>|-- requirements.txt</w:t>
+        <w:br/>
+        <w:t>|-- notebooks/</w:t>
+        <w:br/>
+        <w:t>|-- src/</w:t>
+        <w:br/>
+        <w:t>|-- data/      (raw/, interim/, processed/)</w:t>
+        <w:br/>
+        <w:t>|-- outputs/   (figures/, tables/, models/)</w:t>
+        <w:br/>
+        <w:t>`-- docs/      (Informe_Entrega_Parcial_Proyecto_ML_23F.pdf, Informe_Entrega_Parcial_Proyecto_ML_23F.docx)</w:t>
       </w:r>
     </w:p>
     <w:sectPr>
@@ -9338,451 +8900,6 @@
     </w:sectPr>
   </w:body>
 </w:document>
-</file>
-
-<file path=word/comments.xml><?xml version="1.0" encoding="utf-8"?>
-<w:comments xmlns:mc="http://schemas.openxmlformats.org/markup-compatibility/2006" xmlns:o="urn:schemas-microsoft-com:office:office" xmlns:r="http://schemas.openxmlformats.org/officeDocument/2006/relationships" xmlns:m="http://schemas.openxmlformats.org/officeDocument/2006/math" xmlns:v="urn:schemas-microsoft-com:vml" xmlns:wp="http://schemas.openxmlformats.org/drawingml/2006/wordprocessingDrawing" xmlns:w10="urn:schemas-microsoft-com:office:word" xmlns:w="http://schemas.openxmlformats.org/wordprocessingml/2006/main" xmlns:wne="http://schemas.microsoft.com/office/word/2006/wordml" xmlns:sl="http://schemas.openxmlformats.org/schemaLibrary/2006/main" xmlns:a="http://schemas.openxmlformats.org/drawingml/2006/main" xmlns:pic="http://schemas.openxmlformats.org/drawingml/2006/picture" xmlns:c="http://schemas.openxmlformats.org/drawingml/2006/chart" xmlns:lc="http://schemas.openxmlformats.org/drawingml/2006/lockedCanvas" xmlns:dgm="http://schemas.openxmlformats.org/drawingml/2006/diagram" xmlns:wps="http://schemas.microsoft.com/office/word/2010/wordprocessingShape" xmlns:wpg="http://schemas.microsoft.com/office/word/2010/wordprocessingGroup" xmlns:w14="http://schemas.microsoft.com/office/word/2010/wordml" xmlns:w15="http://schemas.microsoft.com/office/word/2012/wordml" xmlns:w16="http://schemas.microsoft.com/office/word/2018/wordml" xmlns:w16cex="http://schemas.microsoft.com/office/word/2018/wordml/cex" xmlns:w16cid="http://schemas.microsoft.com/office/word/2016/wordml/cid" xmlns="http://schemas.microsoft.com/office/tasks/2019/documenttasks" xmlns:cr="http://schemas.microsoft.com/office/comments/2020/reactions">
-  <w:comment w:author="Hugo Ramiro Villa" w:id="2" w:date="2026-05-02T15:01:46Z">
-    <w:p>
-      <w:pPr>
-        <w:keepNext w:val="0"/>
-        <w:keepLines w:val="0"/>
-        <w:pageBreakBefore w:val="0"/>
-        <w:widowControl w:val="0"/>
-        <w:pBdr>
-          <w:top w:space="0" w:sz="0" w:val="nil"/>
-          <w:left w:space="0" w:sz="0" w:val="nil"/>
-          <w:bottom w:space="0" w:sz="0" w:val="nil"/>
-          <w:right w:space="0" w:sz="0" w:val="nil"/>
-          <w:between w:space="0" w:sz="0" w:val="nil"/>
-        </w:pBdr>
-        <w:shd w:fill="auto" w:val="clear"/>
-        <w:spacing w:after="0" w:before="0" w:line="240" w:lineRule="auto"/>
-        <w:ind w:left="0" w:right="0" w:firstLine="0"/>
-        <w:jc w:val="left"/>
-        <w:rPr>
-          <w:rFonts w:ascii="Arial" w:cs="Arial" w:eastAsia="Arial" w:hAnsi="Arial"/>
-          <w:b w:val="0"/>
-          <w:bCs w:val="0"/>
-          <w:i w:val="0"/>
-          <w:iCs w:val="0"/>
-          <w:smallCaps w:val="0"/>
-          <w:strike w:val="0"/>
-          <w:color w:val="000000"/>
-          <w:sz w:val="22"/>
-          <w:szCs w:val="22"/>
-          <w:u w:val="none"/>
-          <w:shd w:fill="auto" w:val="clear"/>
-          <w:vertAlign w:val="baseline"/>
-        </w:rPr>
-      </w:pPr>
-      <w:r>
-        <w:rPr>
-          <w:rFonts w:ascii="Arial" w:cs="Arial" w:eastAsia="Arial" w:hAnsi="Arial"/>
-          <w:b w:val="0"/>
-          <w:bCs w:val="0"/>
-          <w:i w:val="0"/>
-          <w:iCs w:val="0"/>
-          <w:smallCaps w:val="0"/>
-          <w:strike w:val="0"/>
-          <w:color w:val="000000"/>
-          <w:sz w:val="22"/>
-          <w:szCs w:val="22"/>
-          <w:u w:val="none"/>
-          <w:shd w:fill="auto" w:val="clear"/>
-          <w:vertAlign w:val="baseline"/>
-          <w:rtl w:val="0"/>
-        </w:rPr>
-        <w:t xml:space="preserve">conectar esto con la justificacion de caso del grafo</w:t>
-      </w:r>
-    </w:p>
-  </w:comment>
-  <w:comment w:author="Hugo Ramiro Villa" w:id="3" w:date="2026-05-02T15:04:26Z">
-    <w:p>
-      <w:pPr>
-        <w:keepNext w:val="0"/>
-        <w:keepLines w:val="0"/>
-        <w:pageBreakBefore w:val="0"/>
-        <w:widowControl w:val="0"/>
-        <w:pBdr>
-          <w:top w:space="0" w:sz="0" w:val="nil"/>
-          <w:left w:space="0" w:sz="0" w:val="nil"/>
-          <w:bottom w:space="0" w:sz="0" w:val="nil"/>
-          <w:right w:space="0" w:sz="0" w:val="nil"/>
-          <w:between w:space="0" w:sz="0" w:val="nil"/>
-        </w:pBdr>
-        <w:shd w:fill="auto" w:val="clear"/>
-        <w:spacing w:after="0" w:before="0" w:line="240" w:lineRule="auto"/>
-        <w:ind w:left="0" w:right="0" w:firstLine="0"/>
-        <w:jc w:val="left"/>
-        <w:rPr>
-          <w:rFonts w:ascii="Arial" w:cs="Arial" w:eastAsia="Arial" w:hAnsi="Arial"/>
-          <w:b w:val="0"/>
-          <w:bCs w:val="0"/>
-          <w:i w:val="0"/>
-          <w:iCs w:val="0"/>
-          <w:smallCaps w:val="0"/>
-          <w:strike w:val="0"/>
-          <w:color w:val="000000"/>
-          <w:sz w:val="22"/>
-          <w:szCs w:val="22"/>
-          <w:u w:val="none"/>
-          <w:shd w:fill="auto" w:val="clear"/>
-          <w:vertAlign w:val="baseline"/>
-        </w:rPr>
-      </w:pPr>
-      <w:r>
-        <w:rPr>
-          <w:rFonts w:ascii="Arial" w:cs="Arial" w:eastAsia="Arial" w:hAnsi="Arial"/>
-          <w:b w:val="0"/>
-          <w:bCs w:val="0"/>
-          <w:i w:val="0"/>
-          <w:iCs w:val="0"/>
-          <w:smallCaps w:val="0"/>
-          <w:strike w:val="0"/>
-          <w:color w:val="000000"/>
-          <w:sz w:val="22"/>
-          <w:szCs w:val="22"/>
-          <w:u w:val="none"/>
-          <w:shd w:fill="auto" w:val="clear"/>
-          <w:vertAlign w:val="baseline"/>
-          <w:rtl w:val="0"/>
-        </w:rPr>
-        <w:t xml:space="preserve">la moncloa no la definiria como complementaria si no como comparativa, en el EDA se vio que no aportaba más info extra que RTVE no?</w:t>
-      </w:r>
-    </w:p>
-  </w:comment>
-  <w:comment w:author="Hugo Ramiro Villa" w:id="7" w:date="2026-05-02T15:13:30Z">
-    <w:p>
-      <w:pPr>
-        <w:keepNext w:val="0"/>
-        <w:keepLines w:val="0"/>
-        <w:pageBreakBefore w:val="0"/>
-        <w:widowControl w:val="0"/>
-        <w:pBdr>
-          <w:top w:space="0" w:sz="0" w:val="nil"/>
-          <w:left w:space="0" w:sz="0" w:val="nil"/>
-          <w:bottom w:space="0" w:sz="0" w:val="nil"/>
-          <w:right w:space="0" w:sz="0" w:val="nil"/>
-          <w:between w:space="0" w:sz="0" w:val="nil"/>
-        </w:pBdr>
-        <w:shd w:fill="auto" w:val="clear"/>
-        <w:spacing w:after="0" w:before="0" w:line="240" w:lineRule="auto"/>
-        <w:ind w:left="0" w:right="0" w:firstLine="0"/>
-        <w:jc w:val="left"/>
-        <w:rPr>
-          <w:rFonts w:ascii="Arial" w:cs="Arial" w:eastAsia="Arial" w:hAnsi="Arial"/>
-          <w:b w:val="0"/>
-          <w:bCs w:val="0"/>
-          <w:i w:val="0"/>
-          <w:iCs w:val="0"/>
-          <w:smallCaps w:val="0"/>
-          <w:strike w:val="0"/>
-          <w:color w:val="000000"/>
-          <w:sz w:val="22"/>
-          <w:szCs w:val="22"/>
-          <w:u w:val="none"/>
-          <w:shd w:fill="auto" w:val="clear"/>
-          <w:vertAlign w:val="baseline"/>
-        </w:rPr>
-      </w:pPr>
-      <w:r>
-        <w:rPr>
-          <w:rFonts w:ascii="Arial" w:cs="Arial" w:eastAsia="Arial" w:hAnsi="Arial"/>
-          <w:b w:val="0"/>
-          <w:bCs w:val="0"/>
-          <w:i w:val="0"/>
-          <w:iCs w:val="0"/>
-          <w:smallCaps w:val="0"/>
-          <w:strike w:val="0"/>
-          <w:color w:val="000000"/>
-          <w:sz w:val="22"/>
-          <w:szCs w:val="22"/>
-          <w:u w:val="none"/>
-          <w:shd w:fill="auto" w:val="clear"/>
-          <w:vertAlign w:val="baseline"/>
-          <w:rtl w:val="0"/>
-        </w:rPr>
-        <w:t xml:space="preserve">CAMBIAR CON LOS DATOS QUE YA TENEMOS</w:t>
-      </w:r>
-    </w:p>
-  </w:comment>
-  <w:comment w:author="Hugo Ramiro Villa" w:id="4" w:date="2026-05-02T15:09:01Z">
-    <w:p>
-      <w:pPr>
-        <w:keepNext w:val="0"/>
-        <w:keepLines w:val="0"/>
-        <w:pageBreakBefore w:val="0"/>
-        <w:widowControl w:val="0"/>
-        <w:pBdr>
-          <w:top w:space="0" w:sz="0" w:val="nil"/>
-          <w:left w:space="0" w:sz="0" w:val="nil"/>
-          <w:bottom w:space="0" w:sz="0" w:val="nil"/>
-          <w:right w:space="0" w:sz="0" w:val="nil"/>
-          <w:between w:space="0" w:sz="0" w:val="nil"/>
-        </w:pBdr>
-        <w:shd w:fill="auto" w:val="clear"/>
-        <w:spacing w:after="0" w:before="0" w:line="240" w:lineRule="auto"/>
-        <w:ind w:left="0" w:right="0" w:firstLine="0"/>
-        <w:jc w:val="left"/>
-        <w:rPr>
-          <w:rFonts w:ascii="Arial" w:cs="Arial" w:eastAsia="Arial" w:hAnsi="Arial"/>
-          <w:b w:val="0"/>
-          <w:bCs w:val="0"/>
-          <w:i w:val="0"/>
-          <w:iCs w:val="0"/>
-          <w:smallCaps w:val="0"/>
-          <w:strike w:val="0"/>
-          <w:color w:val="000000"/>
-          <w:sz w:val="22"/>
-          <w:szCs w:val="22"/>
-          <w:u w:val="none"/>
-          <w:shd w:fill="auto" w:val="clear"/>
-          <w:vertAlign w:val="baseline"/>
-        </w:rPr>
-      </w:pPr>
-      <w:r>
-        <w:rPr>
-          <w:rFonts w:ascii="Arial" w:cs="Arial" w:eastAsia="Arial" w:hAnsi="Arial"/>
-          <w:b w:val="0"/>
-          <w:bCs w:val="0"/>
-          <w:i w:val="0"/>
-          <w:iCs w:val="0"/>
-          <w:smallCaps w:val="0"/>
-          <w:strike w:val="0"/>
-          <w:color w:val="000000"/>
-          <w:sz w:val="22"/>
-          <w:szCs w:val="22"/>
-          <w:u w:val="none"/>
-          <w:shd w:fill="auto" w:val="clear"/>
-          <w:vertAlign w:val="baseline"/>
-          <w:rtl w:val="0"/>
-        </w:rPr>
-        <w:t xml:space="preserve">solo comentar las tecnicas que realmente usemos</w:t>
-      </w:r>
-    </w:p>
-  </w:comment>
-  <w:comment w:author="Hugo Ramiro Villa" w:id="0" w:date="2026-05-02T15:07:46Z">
-    <w:p>
-      <w:pPr>
-        <w:keepNext w:val="0"/>
-        <w:keepLines w:val="0"/>
-        <w:pageBreakBefore w:val="0"/>
-        <w:widowControl w:val="0"/>
-        <w:pBdr>
-          <w:top w:space="0" w:sz="0" w:val="nil"/>
-          <w:left w:space="0" w:sz="0" w:val="nil"/>
-          <w:bottom w:space="0" w:sz="0" w:val="nil"/>
-          <w:right w:space="0" w:sz="0" w:val="nil"/>
-          <w:between w:space="0" w:sz="0" w:val="nil"/>
-        </w:pBdr>
-        <w:shd w:fill="auto" w:val="clear"/>
-        <w:spacing w:after="0" w:before="0" w:line="240" w:lineRule="auto"/>
-        <w:ind w:left="0" w:right="0" w:firstLine="0"/>
-        <w:jc w:val="left"/>
-        <w:rPr>
-          <w:rFonts w:ascii="Arial" w:cs="Arial" w:eastAsia="Arial" w:hAnsi="Arial"/>
-          <w:b w:val="0"/>
-          <w:bCs w:val="0"/>
-          <w:i w:val="0"/>
-          <w:iCs w:val="0"/>
-          <w:smallCaps w:val="0"/>
-          <w:strike w:val="0"/>
-          <w:color w:val="000000"/>
-          <w:sz w:val="22"/>
-          <w:szCs w:val="22"/>
-          <w:u w:val="none"/>
-          <w:shd w:fill="auto" w:val="clear"/>
-          <w:vertAlign w:val="baseline"/>
-        </w:rPr>
-      </w:pPr>
-      <w:r>
-        <w:rPr>
-          <w:rFonts w:ascii="Arial" w:cs="Arial" w:eastAsia="Arial" w:hAnsi="Arial"/>
-          <w:b w:val="0"/>
-          <w:bCs w:val="0"/>
-          <w:i w:val="0"/>
-          <w:iCs w:val="0"/>
-          <w:smallCaps w:val="0"/>
-          <w:strike w:val="0"/>
-          <w:color w:val="000000"/>
-          <w:sz w:val="22"/>
-          <w:szCs w:val="22"/>
-          <w:u w:val="none"/>
-          <w:shd w:fill="auto" w:val="clear"/>
-          <w:vertAlign w:val="baseline"/>
-          <w:rtl w:val="0"/>
-        </w:rPr>
-        <w:t xml:space="preserve">solo comentar las tecnicas que realmente usemos</w:t>
-      </w:r>
-    </w:p>
-  </w:comment>
-  <w:comment w:author="Hugo Ramiro Villa" w:id="5" w:date="2026-05-02T15:09:27Z">
-    <w:p>
-      <w:pPr>
-        <w:keepNext w:val="0"/>
-        <w:keepLines w:val="0"/>
-        <w:pageBreakBefore w:val="0"/>
-        <w:widowControl w:val="0"/>
-        <w:pBdr>
-          <w:top w:space="0" w:sz="0" w:val="nil"/>
-          <w:left w:space="0" w:sz="0" w:val="nil"/>
-          <w:bottom w:space="0" w:sz="0" w:val="nil"/>
-          <w:right w:space="0" w:sz="0" w:val="nil"/>
-          <w:between w:space="0" w:sz="0" w:val="nil"/>
-        </w:pBdr>
-        <w:shd w:fill="auto" w:val="clear"/>
-        <w:spacing w:after="0" w:before="0" w:line="240" w:lineRule="auto"/>
-        <w:ind w:left="0" w:right="0" w:firstLine="0"/>
-        <w:jc w:val="left"/>
-        <w:rPr>
-          <w:rFonts w:ascii="Arial" w:cs="Arial" w:eastAsia="Arial" w:hAnsi="Arial"/>
-          <w:b w:val="0"/>
-          <w:bCs w:val="0"/>
-          <w:i w:val="0"/>
-          <w:iCs w:val="0"/>
-          <w:smallCaps w:val="0"/>
-          <w:strike w:val="0"/>
-          <w:color w:val="000000"/>
-          <w:sz w:val="22"/>
-          <w:szCs w:val="22"/>
-          <w:u w:val="none"/>
-          <w:shd w:fill="auto" w:val="clear"/>
-          <w:vertAlign w:val="baseline"/>
-        </w:rPr>
-      </w:pPr>
-      <w:r>
-        <w:rPr>
-          <w:rFonts w:ascii="Arial" w:cs="Arial" w:eastAsia="Arial" w:hAnsi="Arial"/>
-          <w:b w:val="0"/>
-          <w:bCs w:val="0"/>
-          <w:i w:val="0"/>
-          <w:iCs w:val="0"/>
-          <w:smallCaps w:val="0"/>
-          <w:strike w:val="0"/>
-          <w:color w:val="000000"/>
-          <w:sz w:val="22"/>
-          <w:szCs w:val="22"/>
-          <w:u w:val="none"/>
-          <w:shd w:fill="auto" w:val="clear"/>
-          <w:vertAlign w:val="baseline"/>
-          <w:rtl w:val="0"/>
-        </w:rPr>
-        <w:t xml:space="preserve">lo mismo de arriba</w:t>
-      </w:r>
-    </w:p>
-  </w:comment>
-  <w:comment w:author="Hugo Ramiro Villa" w:id="1" w:date="2026-05-02T15:08:10Z">
-    <w:p>
-      <w:pPr>
-        <w:keepNext w:val="0"/>
-        <w:keepLines w:val="0"/>
-        <w:pageBreakBefore w:val="0"/>
-        <w:widowControl w:val="0"/>
-        <w:pBdr>
-          <w:top w:space="0" w:sz="0" w:val="nil"/>
-          <w:left w:space="0" w:sz="0" w:val="nil"/>
-          <w:bottom w:space="0" w:sz="0" w:val="nil"/>
-          <w:right w:space="0" w:sz="0" w:val="nil"/>
-          <w:between w:space="0" w:sz="0" w:val="nil"/>
-        </w:pBdr>
-        <w:shd w:fill="auto" w:val="clear"/>
-        <w:spacing w:after="0" w:before="0" w:line="240" w:lineRule="auto"/>
-        <w:ind w:left="0" w:right="0" w:firstLine="0"/>
-        <w:jc w:val="left"/>
-        <w:rPr>
-          <w:rFonts w:ascii="Arial" w:cs="Arial" w:eastAsia="Arial" w:hAnsi="Arial"/>
-          <w:b w:val="0"/>
-          <w:bCs w:val="0"/>
-          <w:i w:val="0"/>
-          <w:iCs w:val="0"/>
-          <w:smallCaps w:val="0"/>
-          <w:strike w:val="0"/>
-          <w:color w:val="000000"/>
-          <w:sz w:val="22"/>
-          <w:szCs w:val="22"/>
-          <w:u w:val="none"/>
-          <w:shd w:fill="auto" w:val="clear"/>
-          <w:vertAlign w:val="baseline"/>
-        </w:rPr>
-      </w:pPr>
-      <w:r>
-        <w:rPr>
-          <w:rFonts w:ascii="Arial" w:cs="Arial" w:eastAsia="Arial" w:hAnsi="Arial"/>
-          <w:b w:val="0"/>
-          <w:bCs w:val="0"/>
-          <w:i w:val="0"/>
-          <w:iCs w:val="0"/>
-          <w:smallCaps w:val="0"/>
-          <w:strike w:val="0"/>
-          <w:color w:val="000000"/>
-          <w:sz w:val="22"/>
-          <w:szCs w:val="22"/>
-          <w:u w:val="none"/>
-          <w:shd w:fill="auto" w:val="clear"/>
-          <w:vertAlign w:val="baseline"/>
-          <w:rtl w:val="0"/>
-        </w:rPr>
-        <w:t xml:space="preserve">cuando tengamos los casos hechos esto hay que cambiarlo</w:t>
-      </w:r>
-    </w:p>
-  </w:comment>
-  <w:comment w:author="Hugo Ramiro Villa" w:id="6" w:date="2026-05-02T15:11:52Z">
-    <w:p>
-      <w:pPr>
-        <w:keepNext w:val="0"/>
-        <w:keepLines w:val="0"/>
-        <w:pageBreakBefore w:val="0"/>
-        <w:widowControl w:val="0"/>
-        <w:pBdr>
-          <w:top w:space="0" w:sz="0" w:val="nil"/>
-          <w:left w:space="0" w:sz="0" w:val="nil"/>
-          <w:bottom w:space="0" w:sz="0" w:val="nil"/>
-          <w:right w:space="0" w:sz="0" w:val="nil"/>
-          <w:between w:space="0" w:sz="0" w:val="nil"/>
-        </w:pBdr>
-        <w:shd w:fill="auto" w:val="clear"/>
-        <w:spacing w:after="0" w:before="0" w:line="240" w:lineRule="auto"/>
-        <w:ind w:left="0" w:right="0" w:firstLine="0"/>
-        <w:jc w:val="left"/>
-        <w:rPr>
-          <w:rFonts w:ascii="Arial" w:cs="Arial" w:eastAsia="Arial" w:hAnsi="Arial"/>
-          <w:b w:val="0"/>
-          <w:bCs w:val="0"/>
-          <w:i w:val="0"/>
-          <w:iCs w:val="0"/>
-          <w:smallCaps w:val="0"/>
-          <w:strike w:val="0"/>
-          <w:color w:val="000000"/>
-          <w:sz w:val="22"/>
-          <w:szCs w:val="22"/>
-          <w:u w:val="none"/>
-          <w:shd w:fill="auto" w:val="clear"/>
-          <w:vertAlign w:val="baseline"/>
-        </w:rPr>
-      </w:pPr>
-      <w:r>
-        <w:rPr>
-          <w:rFonts w:ascii="Arial" w:cs="Arial" w:eastAsia="Arial" w:hAnsi="Arial"/>
-          <w:b w:val="0"/>
-          <w:bCs w:val="0"/>
-          <w:i w:val="0"/>
-          <w:iCs w:val="0"/>
-          <w:smallCaps w:val="0"/>
-          <w:strike w:val="0"/>
-          <w:color w:val="000000"/>
-          <w:sz w:val="22"/>
-          <w:szCs w:val="22"/>
-          <w:u w:val="none"/>
-          <w:shd w:fill="auto" w:val="clear"/>
-          <w:vertAlign w:val="baseline"/>
-          <w:rtl w:val="0"/>
-        </w:rPr>
-        <w:t xml:space="preserve">cambiar</w:t>
-      </w:r>
-    </w:p>
-  </w:comment>
-</w:comments>
 </file>
 
 <file path=word/footer1.xml><?xml version="1.0" encoding="utf-8"?>

</xml_diff>